<commit_message>
fix: Replace hardcoded stats with dynamic computation from CSV
- National SD: 5.56 (stale) → computed from CSV (5.69)
- Top 3 neuropathic prefectures: hardcoded values → dynamically sorted from CSV
  Iwate 566.7→565.5, Aomori 519.3→519.9, Akita 461.1→459.3
- Added PREF_EN mapping for English prefecture names in EN script
- Applied same national SD fix in JA script

Co-Authored-By: Tatsuki Onishi <bougtoir@gmail.com>
</commit_message>
<xml_diff>
--- a/ndb-pain-regional-variation-japan/output/bmjopen/BMJOpen_manuscript_EN.docx
+++ b/ndb-pain-regional-variation-japan/output/bmjopen/BMJOpen_manuscript_EN.docx
@@ -651,7 +651,7 @@
     </w:p>
     <w:p>
       <w:r>
-        <w:t>During April 2023–March 2024, the NDB recorded 7,903,515 inpatient surgical procedures and 274,579,851 analgesic prescription units across 47 prefectures. The national mean analgesic-per-surgery index was 35.78 (SD 5.56), ranging from 25.20 (Gifu) to 49.75 (Kagoshima)—a 1.97-fold difference (Kruskal–Wallis P&lt;0.001 across nine regions; table 1).</w:t>
+        <w:t>During April 2023–March 2024, the NDB recorded 7,903,515 inpatient surgical procedures and 274,579,851 analgesic prescription units across 47 prefectures. The national mean analgesic-per-surgery index was 35.78 (SD 5.69), ranging from 25.20 (Gifu) to 49.75 (Kagoshima)—a 1.97-fold difference (Kruskal–Wallis P&lt;0.001 across nine regions; table 1).</w:t>
       </w:r>
     </w:p>
     <w:p>
@@ -1258,7 +1258,7 @@
     </w:p>
     <w:p>
       <w:r>
-        <w:t>Nationally, outpatient neuropathic pain drug prescriptions totalled 2,289,549,163 units, comprising pregabalin (40.2%), neurotropin (20.1%), mirogabalin (19.6%), duloxetine (15.3%), and tramadol (4.9%). Tohoku had a markedly higher neuropathic pain prescribing-per-surgery index (432.8 vs 282.5; P&lt;0.001; d=2.81), with Iwate (566.7), Aomori (519.3), and Akita (461.1) occupying the top three nationally (figure 1).</w:t>
+        <w:t>Nationally, outpatient neuropathic pain drug prescriptions totalled 2,289,549,163 units, comprising pregabalin (40.2%), neurotropin (20.1%), mirogabalin (19.6%), duloxetine (15.3%), and tramadol (4.9%). Tohoku had a markedly higher neuropathic pain prescribing-per-surgery index (432.8 vs 282.5; P&lt;0.001; d=2.81), with Iwate (565.5), Aomori (519.9), and Akita (459.3) occupying the top three nationally (figure 1).</w:t>
       </w:r>
     </w:p>
     <w:p>

</xml_diff>